<commit_message>
Update CV and site for Toronto base
</commit_message>
<xml_diff>
--- a/Oakley Gompels 2026.docx
+++ b/Oakley Gompels 2026.docx
@@ -51,7 +51,7 @@
         <w:pBdr>
           <w:bottom w:val="single" w:color="000000" w:sz="6" w:space="1"/>
         </w:pBdr>
-        <w:spacing w:after="50" w:before="120"/>
+        <w:spacing w:after="40" w:before="100"/>
       </w:pPr>
       <w:r>
         <w:rPr>
@@ -70,7 +70,7 @@
         <w:tabs>
           <w:tab w:val="right" w:pos="10512"/>
         </w:tabs>
-        <w:spacing w:after="10" w:before="70"/>
+        <w:spacing w:after="8" w:before="55"/>
       </w:pPr>
       <w:r>
         <w:rPr>
@@ -113,46 +113,76 @@
       <w:r>
         <w:rPr>
           <w:rFonts w:ascii="Times New Roman" w:cs="Times New Roman" w:eastAsia="Times New Roman" w:hAnsi="Times New Roman"/>
-          <w:sz w:val="19"/>
-          <w:szCs w:val="19"/>
-        </w:rPr>
-        <w:t xml:space="preserve">Certificate in Business, Rotman Commerce.</w:t>
-      </w:r>
-    </w:p>
-    <w:p>
-      <w:pPr>
-        <w:pStyle w:val="ListParagraph"/>
-        <w:numPr>
-          <w:ilvl w:val="0"/>
-          <w:numId w:val="2"/>
-        </w:numPr>
-        <w:spacing w:after="10"/>
-      </w:pPr>
-      <w:r>
-        <w:rPr>
-          <w:rFonts w:ascii="Times New Roman" w:cs="Times New Roman" w:eastAsia="Times New Roman" w:hAnsi="Times New Roman"/>
-          <w:sz w:val="19"/>
-          <w:szCs w:val="19"/>
-        </w:rPr>
-        <w:t xml:space="preserve">Relevant coursework: Ordinary and Partial Differential Equations, Linear Algebra, Multivariable Calculus, Complex Variables, Combinatorics, Computational Physics, Advanced Classical Mechanics.</w:t>
-      </w:r>
-    </w:p>
-    <w:p>
-      <w:pPr>
-        <w:pStyle w:val="ListParagraph"/>
-        <w:numPr>
-          <w:ilvl w:val="0"/>
-          <w:numId w:val="2"/>
-        </w:numPr>
-        <w:spacing w:after="10"/>
-      </w:pPr>
-      <w:r>
-        <w:rPr>
-          <w:rFonts w:ascii="Times New Roman" w:cs="Times New Roman" w:eastAsia="Times New Roman" w:hAnsi="Times New Roman"/>
-          <w:sz w:val="19"/>
-          <w:szCs w:val="19"/>
-        </w:rPr>
-        <w:t xml:space="preserve">Supplementary: Economics, Business Ethics, Environmental Sustainability, Psychology.</w:t>
+          <w:b/>
+          <w:bCs/>
+          <w:sz w:val="19"/>
+          <w:szCs w:val="19"/>
+        </w:rPr>
+        <w:t xml:space="preserve">Relevant coursework: </w:t>
+      </w:r>
+      <w:r>
+        <w:rPr>
+          <w:rFonts w:ascii="Times New Roman" w:cs="Times New Roman" w:eastAsia="Times New Roman" w:hAnsi="Times New Roman"/>
+          <w:sz w:val="19"/>
+          <w:szCs w:val="19"/>
+        </w:rPr>
+        <w:t xml:space="preserve">Ordinary and Partial Differential Equations, Linear Algebra, Multivariable Calculus, Complex Variables, Combinatorics, Computational Physics, Advanced Classical Mechanics.</w:t>
+      </w:r>
+    </w:p>
+    <w:p>
+      <w:pPr>
+        <w:pStyle w:val="ListParagraph"/>
+        <w:numPr>
+          <w:ilvl w:val="0"/>
+          <w:numId w:val="2"/>
+        </w:numPr>
+        <w:spacing w:after="10"/>
+      </w:pPr>
+      <w:r>
+        <w:rPr>
+          <w:rFonts w:ascii="Times New Roman" w:cs="Times New Roman" w:eastAsia="Times New Roman" w:hAnsi="Times New Roman"/>
+          <w:b/>
+          <w:bCs/>
+          <w:sz w:val="19"/>
+          <w:szCs w:val="19"/>
+        </w:rPr>
+        <w:t xml:space="preserve">Supplementary: </w:t>
+      </w:r>
+      <w:r>
+        <w:rPr>
+          <w:rFonts w:ascii="Times New Roman" w:cs="Times New Roman" w:eastAsia="Times New Roman" w:hAnsi="Times New Roman"/>
+          <w:sz w:val="19"/>
+          <w:szCs w:val="19"/>
+        </w:rPr>
+        <w:t xml:space="preserve">Economics, Business Ethics, Environmental Sustainability, Psychology.</w:t>
+      </w:r>
+    </w:p>
+    <w:p>
+      <w:pPr>
+        <w:pStyle w:val="ListParagraph"/>
+        <w:numPr>
+          <w:ilvl w:val="0"/>
+          <w:numId w:val="2"/>
+        </w:numPr>
+        <w:spacing w:after="10"/>
+      </w:pPr>
+      <w:r>
+        <w:rPr>
+          <w:rFonts w:ascii="Times New Roman" w:cs="Times New Roman" w:eastAsia="Times New Roman" w:hAnsi="Times New Roman"/>
+          <w:b/>
+          <w:bCs/>
+          <w:sz w:val="19"/>
+          <w:szCs w:val="19"/>
+        </w:rPr>
+        <w:t xml:space="preserve">Certificate in Business, Rotman Commerce: </w:t>
+      </w:r>
+      <w:r>
+        <w:rPr>
+          <w:rFonts w:ascii="Times New Roman" w:cs="Times New Roman" w:eastAsia="Times New Roman" w:hAnsi="Times New Roman"/>
+          <w:sz w:val="19"/>
+          <w:szCs w:val="19"/>
+        </w:rPr>
+        <w:t xml:space="preserve">Finance, Accounting, Marketing, Business.</w:t>
       </w:r>
     </w:p>
     <w:p>
@@ -161,7 +191,7 @@
         <w:tabs>
           <w:tab w:val="right" w:pos="10512"/>
         </w:tabs>
-        <w:spacing w:after="10" w:before="70"/>
+        <w:spacing w:after="8" w:before="55"/>
       </w:pPr>
       <w:r>
         <w:rPr>
@@ -233,7 +263,7 @@
         <w:pBdr>
           <w:bottom w:val="single" w:color="000000" w:sz="6" w:space="1"/>
         </w:pBdr>
-        <w:spacing w:after="50" w:before="120"/>
+        <w:spacing w:after="40" w:before="100"/>
       </w:pPr>
       <w:r>
         <w:rPr>
@@ -271,7 +301,35 @@
           <w:sz w:val="19"/>
           <w:szCs w:val="19"/>
         </w:rPr>
-        <w:t xml:space="preserve">Python (NumPy, SciPy, Matplotlib), JavaScript, HTML/CSS, LaTeX, Excel, Microsoft Office, AI workflow automation, data visualization.</w:t>
+        <w:t xml:space="preserve">Python (NumPy, SciPy, Matplotlib), JavaScript, HTML/CSS, LaTeX, Microsoft Office (Excel, Word, PowerPoint), web scraping, data visualization.</w:t>
+      </w:r>
+    </w:p>
+    <w:p>
+      <w:pPr>
+        <w:pStyle w:val="ListParagraph"/>
+        <w:numPr>
+          <w:ilvl w:val="0"/>
+          <w:numId w:val="2"/>
+        </w:numPr>
+        <w:spacing w:after="10"/>
+      </w:pPr>
+      <w:r>
+        <w:rPr>
+          <w:rFonts w:ascii="Times New Roman" w:cs="Times New Roman" w:eastAsia="Times New Roman" w:hAnsi="Times New Roman"/>
+          <w:b/>
+          <w:bCs/>
+          <w:sz w:val="19"/>
+          <w:szCs w:val="19"/>
+        </w:rPr>
+        <w:t xml:space="preserve">AI and Automation: </w:t>
+      </w:r>
+      <w:r>
+        <w:rPr>
+          <w:rFonts w:ascii="Times New Roman" w:cs="Times New Roman" w:eastAsia="Times New Roman" w:hAnsi="Times New Roman"/>
+          <w:sz w:val="19"/>
+          <w:szCs w:val="19"/>
+        </w:rPr>
+        <w:t xml:space="preserve">AI agents, AI workflow prototyping, process automation, business process design.</w:t>
       </w:r>
     </w:p>
     <w:p>
@@ -299,7 +357,35 @@
           <w:sz w:val="19"/>
           <w:szCs w:val="19"/>
         </w:rPr>
-        <w:t xml:space="preserve">Financial modelling, equity valuation, statistical and time-series modelling, optimization, supplier sourcing and negotiation, market analysis.</w:t>
+        <w:t xml:space="preserve">Financial modelling, equity valuation, statistical and time-series modelling, uncertainty analysis, optimization, market research.</w:t>
+      </w:r>
+    </w:p>
+    <w:p>
+      <w:pPr>
+        <w:pStyle w:val="ListParagraph"/>
+        <w:numPr>
+          <w:ilvl w:val="0"/>
+          <w:numId w:val="2"/>
+        </w:numPr>
+        <w:spacing w:after="10"/>
+      </w:pPr>
+      <w:r>
+        <w:rPr>
+          <w:rFonts w:ascii="Times New Roman" w:cs="Times New Roman" w:eastAsia="Times New Roman" w:hAnsi="Times New Roman"/>
+          <w:b/>
+          <w:bCs/>
+          <w:sz w:val="19"/>
+          <w:szCs w:val="19"/>
+        </w:rPr>
+        <w:t xml:space="preserve">Operations and Leadership: </w:t>
+      </w:r>
+      <w:r>
+        <w:rPr>
+          <w:rFonts w:ascii="Times New Roman" w:cs="Times New Roman" w:eastAsia="Times New Roman" w:hAnsi="Times New Roman"/>
+          <w:sz w:val="19"/>
+          <w:szCs w:val="19"/>
+        </w:rPr>
+        <w:t xml:space="preserve">Supplier sourcing, negotiation and due diligence, process optimization, team leadership, change management.</w:t>
       </w:r>
     </w:p>
     <w:p>
@@ -335,7 +421,7 @@
         <w:pBdr>
           <w:bottom w:val="single" w:color="000000" w:sz="6" w:space="1"/>
         </w:pBdr>
-        <w:spacing w:after="50" w:before="120"/>
+        <w:spacing w:after="40" w:before="100"/>
       </w:pPr>
       <w:r>
         <w:rPr>
@@ -354,7 +440,7 @@
         <w:tabs>
           <w:tab w:val="right" w:pos="10512"/>
         </w:tabs>
-        <w:spacing w:after="10" w:before="70"/>
+        <w:spacing w:after="8" w:before="55"/>
       </w:pPr>
       <w:r>
         <w:rPr>
@@ -418,25 +504,7 @@
           <w:sz w:val="19"/>
           <w:szCs w:val="19"/>
         </w:rPr>
-        <w:t xml:space="preserve">Built a data-scraping and AI outreach pipeline to find factories across China and screen out trading companies, so negotiations started with verified manufacturers instead of one email at a time.</w:t>
-      </w:r>
-    </w:p>
-    <w:p>
-      <w:pPr>
-        <w:pStyle w:val="ListParagraph"/>
-        <w:numPr>
-          <w:ilvl w:val="0"/>
-          <w:numId w:val="2"/>
-        </w:numPr>
-        <w:spacing w:after="10"/>
-      </w:pPr>
-      <w:r>
-        <w:rPr>
-          <w:rFonts w:ascii="Times New Roman" w:cs="Times New Roman" w:eastAsia="Times New Roman" w:hAnsi="Times New Roman"/>
-          <w:sz w:val="19"/>
-          <w:szCs w:val="19"/>
-        </w:rPr>
-        <w:t xml:space="preserve">Travelled to Shanghai to run quality control and negotiate pricing in person, selecting the final manufacturer and closing a machinery sourcing deal from first search through to shipment.</w:t>
+        <w:t xml:space="preserve">Led the procurement of warehouse machinery from China, building a data-scraping and AI outreach pipeline to identify and verify manufacturers, then conducting on-site quality inspections and price negotiations in Shanghai to select the supplier and complete the order through to shipment.</w:t>
       </w:r>
     </w:p>
     <w:p>
@@ -472,7 +540,7 @@
           <w:sz w:val="19"/>
           <w:szCs w:val="19"/>
         </w:rPr>
-        <w:t xml:space="preserve">Helped draft the property contracts behind the company's move to a new warehouse.</w:t>
+        <w:t xml:space="preserve">Drafted the heads of terms (letter of intent) for the new warehouse to reduce legal costs, supported by market research on comparable properties to benchmark pricing.</w:t>
       </w:r>
     </w:p>
     <w:p>
@@ -481,7 +549,7 @@
         <w:tabs>
           <w:tab w:val="right" w:pos="10512"/>
         </w:tabs>
-        <w:spacing w:after="10" w:before="70"/>
+        <w:spacing w:after="8" w:before="55"/>
       </w:pPr>
       <w:r>
         <w:rPr>
@@ -572,7 +640,7 @@
         <w:tabs>
           <w:tab w:val="right" w:pos="10512"/>
         </w:tabs>
-        <w:spacing w:after="10" w:before="70"/>
+        <w:spacing w:after="8" w:before="55"/>
       </w:pPr>
       <w:r>
         <w:rPr>
@@ -626,7 +694,7 @@
         <w:pBdr>
           <w:bottom w:val="single" w:color="000000" w:sz="6" w:space="1"/>
         </w:pBdr>
-        <w:spacing w:after="50" w:before="120"/>
+        <w:spacing w:after="40" w:before="100"/>
       </w:pPr>
       <w:r>
         <w:rPr>
@@ -645,7 +713,7 @@
         <w:tabs>
           <w:tab w:val="right" w:pos="10512"/>
         </w:tabs>
-        <w:spacing w:after="10" w:before="70"/>
+        <w:spacing w:after="8" w:before="55"/>
       </w:pPr>
       <w:r>
         <w:rPr>
@@ -736,7 +804,7 @@
         <w:tabs>
           <w:tab w:val="right" w:pos="10512"/>
         </w:tabs>
-        <w:spacing w:after="10" w:before="70"/>
+        <w:spacing w:after="8" w:before="55"/>
       </w:pPr>
       <w:r>
         <w:rPr>
@@ -827,7 +895,7 @@
         <w:tabs>
           <w:tab w:val="right" w:pos="10512"/>
         </w:tabs>
-        <w:spacing w:after="10" w:before="70"/>
+        <w:spacing w:after="8" w:before="55"/>
       </w:pPr>
       <w:r>
         <w:rPr>
@@ -882,7 +950,7 @@
         <w:tabs>
           <w:tab w:val="right" w:pos="10512"/>
         </w:tabs>
-        <w:spacing w:after="10" w:before="70"/>
+        <w:spacing w:after="8" w:before="55"/>
       </w:pPr>
       <w:r>
         <w:rPr>
@@ -937,7 +1005,7 @@
         <w:tabs>
           <w:tab w:val="right" w:pos="10512"/>
         </w:tabs>
-        <w:spacing w:after="10" w:before="70"/>
+        <w:spacing w:after="8" w:before="55"/>
       </w:pPr>
       <w:r>
         <w:rPr>

</xml_diff>